<commit_message>
Phase 5: Rule Engine
</commit_message>
<xml_diff>
--- a/Local_Logs/New Microsoft Word Document.docx
+++ b/Local_Logs/New Microsoft Word Document.docx
@@ -15,23 +15,7 @@
           <w:b/>
           <w:bCs/>
         </w:rPr>
-        <w:t>2. Extract insightengine_phase2.zip</w:t>
-      </w:r>
-    </w:p>
-    <w:p>
-      <w:pPr>
-        <w:spacing w:after="0"/>
-      </w:pPr>
-      <w:r>
-        <w:t>Extract it to a temporary folder, for example:</w:t>
-      </w:r>
-    </w:p>
-    <w:p>
-      <w:pPr>
-        <w:spacing w:after="0"/>
-      </w:pPr>
-      <w:r>
-        <w:t>D:\Temp\insightengine_phase2</w:t>
+        <w:t>Extract insightengine_phase.zip</w:t>
       </w:r>
     </w:p>
     <w:p>
@@ -57,15 +41,21 @@
           <w:b/>
           <w:bCs/>
         </w:rPr>
-        <w:t>3. Copy files</w:t>
-      </w:r>
-    </w:p>
-    <w:p>
-      <w:pPr>
-        <w:spacing w:after="0"/>
-      </w:pPr>
-      <w:r>
-        <w:t>Copy everything from the extracted Phase 2 folder into:</w:t>
+        <w:t>Copy files</w:t>
+      </w:r>
+    </w:p>
+    <w:p>
+      <w:pPr>
+        <w:spacing w:after="0"/>
+      </w:pPr>
+      <w:r>
+        <w:t xml:space="preserve">Copy everything from the extracted </w:t>
+      </w:r>
+      <w:r>
+        <w:t xml:space="preserve">current </w:t>
+      </w:r>
+      <w:r>
+        <w:t>Phase folder into:</w:t>
       </w:r>
     </w:p>
     <w:p>
@@ -82,14 +72,6 @@
       </w:pPr>
       <w:r>
         <w:t>Replace existing files when prompted.</w:t>
-      </w:r>
-    </w:p>
-    <w:p>
-      <w:pPr>
-        <w:spacing w:after="0"/>
-      </w:pPr>
-      <w:r>
-        <w:t>This is expected because Phase 2 builds on Phase 1.</w:t>
       </w:r>
     </w:p>
     <w:p>
@@ -115,7 +97,7 @@
           <w:b/>
           <w:bCs/>
         </w:rPr>
-        <w:t>4. Check what changed</w:t>
+        <w:t>Check what changed</w:t>
       </w:r>
     </w:p>
     <w:p>
@@ -163,7 +145,7 @@
         <w:spacing w:after="0"/>
       </w:pPr>
       <w:r>
-        <w:t xml:space="preserve">New files (like core/codebook.py) </w:t>
+        <w:t>New files</w:t>
       </w:r>
     </w:p>
     <w:p>
@@ -209,7 +191,7 @@
           <w:b/>
           <w:bCs/>
         </w:rPr>
-        <w:t>5. Verify locally</w:t>
+        <w:t>Verify locally</w:t>
       </w:r>
     </w:p>
     <w:p>
@@ -225,14 +207,23 @@
         <w:spacing w:after="0"/>
       </w:pPr>
       <w:r>
+        <w:rPr>
+          <w:highlight w:val="yellow"/>
+        </w:rPr>
         <w:t xml:space="preserve">pip install -e </w:t>
       </w:r>
       <w:proofErr w:type="gramStart"/>
       <w:r>
+        <w:rPr>
+          <w:highlight w:val="yellow"/>
+        </w:rPr>
         <w:t>".[</w:t>
       </w:r>
       <w:proofErr w:type="gramEnd"/>
       <w:r>
+        <w:rPr>
+          <w:highlight w:val="yellow"/>
+        </w:rPr>
         <w:t>dev]"</w:t>
       </w:r>
     </w:p>
@@ -251,10 +242,16 @@
       <w:proofErr w:type="spellStart"/>
       <w:proofErr w:type="gramStart"/>
       <w:r>
+        <w:rPr>
+          <w:highlight w:val="yellow"/>
+        </w:rPr>
         <w:t>pytest</w:t>
       </w:r>
       <w:proofErr w:type="spellEnd"/>
       <w:r>
+        <w:rPr>
+          <w:highlight w:val="yellow"/>
+        </w:rPr>
         <w:t xml:space="preserve"> -v</w:t>
       </w:r>
       <w:proofErr w:type="gramEnd"/>
@@ -273,26 +270,44 @@
       </w:pPr>
       <w:proofErr w:type="spellStart"/>
       <w:r>
+        <w:rPr>
+          <w:highlight w:val="yellow"/>
+        </w:rPr>
         <w:t>mypy</w:t>
       </w:r>
       <w:proofErr w:type="spellEnd"/>
       <w:r>
+        <w:rPr>
+          <w:highlight w:val="yellow"/>
+        </w:rPr>
         <w:t xml:space="preserve"> </w:t>
       </w:r>
       <w:proofErr w:type="spellStart"/>
       <w:r>
+        <w:rPr>
+          <w:highlight w:val="yellow"/>
+        </w:rPr>
         <w:t>src</w:t>
       </w:r>
       <w:proofErr w:type="spellEnd"/>
       <w:r>
+        <w:rPr>
+          <w:highlight w:val="yellow"/>
+        </w:rPr>
         <w:t>/</w:t>
       </w:r>
       <w:proofErr w:type="spellStart"/>
       <w:r>
+        <w:rPr>
+          <w:highlight w:val="yellow"/>
+        </w:rPr>
         <w:t>insightengine</w:t>
       </w:r>
       <w:proofErr w:type="spellEnd"/>
       <w:r>
+        <w:rPr>
+          <w:highlight w:val="yellow"/>
+        </w:rPr>
         <w:t xml:space="preserve"> --strict</w:t>
       </w:r>
     </w:p>
@@ -309,7 +324,13 @@
       </w:r>
       <w:proofErr w:type="gramEnd"/>
       <w:r>
-        <w:t xml:space="preserve"> these pass, Phase 2 is technically sound.</w:t>
+        <w:t xml:space="preserve"> these pass, </w:t>
+      </w:r>
+      <w:r>
+        <w:t xml:space="preserve">current </w:t>
+      </w:r>
+      <w:r>
+        <w:t>Phase is technically sound.</w:t>
       </w:r>
     </w:p>
     <w:p>
@@ -335,7 +356,7 @@
           <w:b/>
           <w:bCs/>
         </w:rPr>
-        <w:t>6. Review the code</w:t>
+        <w:t>Review the code</w:t>
       </w:r>
     </w:p>
     <w:p>
@@ -354,8 +375,21 @@
         </w:numPr>
         <w:spacing w:after="0"/>
       </w:pPr>
-      <w:r>
-        <w:t xml:space="preserve">src/insightengine/core/codebook.py </w:t>
+      <w:proofErr w:type="spellStart"/>
+      <w:r>
+        <w:t>src</w:t>
+      </w:r>
+      <w:proofErr w:type="spellEnd"/>
+      <w:r>
+        <w:t>/</w:t>
+      </w:r>
+      <w:proofErr w:type="spellStart"/>
+      <w:r>
+        <w:t>insightengine</w:t>
+      </w:r>
+      <w:proofErr w:type="spellEnd"/>
+      <w:r>
+        <w:t xml:space="preserve">/ </w:t>
       </w:r>
     </w:p>
     <w:p>
@@ -379,7 +413,7 @@
         <w:spacing w:after="0"/>
       </w:pPr>
       <w:r>
-        <w:t xml:space="preserve">Any changes to exceptions.py </w:t>
+        <w:t>Any changes</w:t>
       </w:r>
     </w:p>
     <w:p>
@@ -413,18 +447,27 @@
           <w:b/>
           <w:bCs/>
         </w:rPr>
-        <w:t>7. Commit Phase 2</w:t>
-      </w:r>
-    </w:p>
-    <w:p>
-      <w:pPr>
-        <w:spacing w:after="0"/>
-      </w:pPr>
-      <w:r>
+        <w:t>Commit Phase</w:t>
+      </w:r>
+    </w:p>
+    <w:p>
+      <w:pPr>
+        <w:spacing w:after="0"/>
+        <w:rPr>
+          <w:highlight w:val="yellow"/>
+        </w:rPr>
+      </w:pPr>
+      <w:r>
+        <w:rPr>
+          <w:highlight w:val="yellow"/>
+        </w:rPr>
         <w:t xml:space="preserve">git </w:t>
       </w:r>
       <w:proofErr w:type="gramStart"/>
       <w:r>
+        <w:rPr>
+          <w:highlight w:val="yellow"/>
+        </w:rPr>
         <w:t>add .</w:t>
       </w:r>
       <w:proofErr w:type="gramEnd"/>
@@ -434,6 +477,9 @@
         <w:spacing w:after="0"/>
       </w:pPr>
       <w:r>
+        <w:rPr>
+          <w:highlight w:val="yellow"/>
+        </w:rPr>
         <w:t>git commit -m "Phase 2: Core Domain Model"</w:t>
       </w:r>
     </w:p>
@@ -460,14 +506,17 @@
           <w:b/>
           <w:bCs/>
         </w:rPr>
-        <w:t>8. Push</w:t>
-      </w:r>
-    </w:p>
-    <w:p>
-      <w:pPr>
-        <w:spacing w:after="0"/>
-      </w:pPr>
-      <w:r>
+        <w:t>Push</w:t>
+      </w:r>
+    </w:p>
+    <w:p>
+      <w:pPr>
+        <w:spacing w:after="0"/>
+      </w:pPr>
+      <w:r>
+        <w:rPr>
+          <w:highlight w:val="yellow"/>
+        </w:rPr>
         <w:t>git push</w:t>
       </w:r>
     </w:p>
@@ -476,7 +525,6 @@
         <w:spacing w:after="0"/>
       </w:pPr>
       <w:r>
-        <w:lastRenderedPageBreak/>
         <w:pict w14:anchorId="3A322931">
           <v:rect id="_x0000_i1073" style="width:0;height:1.5pt" o:hralign="center" o:hrstd="t" o:hr="t" fillcolor="#a0a0a0" stroked="f"/>
         </w:pict>
@@ -495,14 +543,20 @@
           <w:b/>
           <w:bCs/>
         </w:rPr>
-        <w:t>9. Tag Phase 2</w:t>
-      </w:r>
-    </w:p>
-    <w:p>
-      <w:pPr>
-        <w:spacing w:after="0"/>
-      </w:pPr>
-      <w:r>
+        <w:t>Tag Phase</w:t>
+      </w:r>
+    </w:p>
+    <w:p>
+      <w:pPr>
+        <w:spacing w:after="0"/>
+        <w:rPr>
+          <w:highlight w:val="yellow"/>
+        </w:rPr>
+      </w:pPr>
+      <w:r>
+        <w:rPr>
+          <w:highlight w:val="yellow"/>
+        </w:rPr>
         <w:t>git tag v0.2.0-phase2</w:t>
       </w:r>
     </w:p>
@@ -511,6 +565,9 @@
         <w:spacing w:after="0"/>
       </w:pPr>
       <w:r>
+        <w:rPr>
+          <w:highlight w:val="yellow"/>
+        </w:rPr>
         <w:t>git push origin v0.2.0-phase2</w:t>
       </w:r>
     </w:p>
@@ -521,7 +578,7 @@
     </w:p>
     <w:sectPr>
       <w:pgSz w:w="11906" w:h="16838"/>
-      <w:pgMar w:top="1440" w:right="1440" w:bottom="1440" w:left="1440" w:header="708" w:footer="708" w:gutter="0"/>
+      <w:pgMar w:top="630" w:right="1440" w:bottom="1440" w:left="990" w:header="708" w:footer="708" w:gutter="0"/>
       <w:cols w:space="708"/>
       <w:docGrid w:linePitch="360"/>
     </w:sectPr>

</xml_diff>